<commit_message>
Documento de estructura: actualizado con los cambios del 26 y 27 de octubre (textos corregidos y nueva sección 10 con el resumen)
Co-Authored-By: Claude Opus 5.5 <noreply@anthropic.com>
</commit_message>
<xml_diff>
--- a/reference/estructura-sitio.docx
+++ b/reference/estructura-sitio.docx
@@ -59,7 +59,7 @@
         <w:rPr>
           <w:color w:val="5F6670"/>
         </w:rPr>
-        <w:t xml:space="preserve">Versión del mockup: 26 de octubre de 2026</w:t>
+        <w:t xml:space="preserve">Versión del mockup: 27 de octubre de 2026</w:t>
       </w:r>
     </w:p>
     <w:p>
@@ -2420,7 +2420,7 @@
                 <w:sz w:val="18"/>
                 <w:szCs w:val="18"/>
               </w:rPr>
-              <w:t xml:space="preserve">Tres tarjetas con foto que llevan a cada página de servicio.</w:t>
+              <w:t xml:space="preserve">Tres tarjetas apiladas al hacer scroll, que llevan a cada página de servicio.</w:t>
             </w:r>
           </w:p>
         </w:tc>
@@ -3488,7 +3488,7 @@
         <w:spacing w:after="60"/>
       </w:pPr>
       <w:r>
-        <w:t xml:space="preserve">ALTA AGM: Foro de líderes (500 asistentes · Ciudad de México)</w:t>
+        <w:t xml:space="preserve">ALTA AGM: App de la conferencia (500 asistentes · Ciudad de México)</w:t>
       </w:r>
     </w:p>
     <w:p>
@@ -3501,7 +3501,7 @@
         <w:spacing w:after="60"/>
       </w:pPr>
       <w:r>
-        <w:t xml:space="preserve">ACI-LAC / WAGA: WAGA 2026 (692 asistentes · Lima 2026)</w:t>
+        <w:t xml:space="preserve">ACI-LAC / WAGA: Sesión general (692 asistentes · Lima 2026)</w:t>
       </w:r>
     </w:p>
     <w:p>
@@ -3527,7 +3527,7 @@
         <w:spacing w:after="60"/>
       </w:pPr>
       <w:r>
-        <w:t xml:space="preserve">ALTA CCMA &amp; MRO: Sesión plenaria</w:t>
+        <w:t xml:space="preserve">ALTA CCMA &amp; MRO: Sesión general</w:t>
       </w:r>
     </w:p>
     <w:p>
@@ -9844,7 +9844,7 @@
         <w:spacing w:after="60"/>
       </w:pPr>
       <w:r>
-        <w:t xml:space="preserve">Datos: "Miles" de productos · "desde $0.53" por lanyard a todo color · compra "Por evento" o industria.</w:t>
+        <w:t xml:space="preserve">Datos: "1.000+" productos · "desde $0.53" por lanyard a todo color · compra "Por evento" o industria.</w:t>
       </w:r>
     </w:p>
     <w:p>
@@ -9917,7 +9917,7 @@
           <w:sz w:val="19"/>
           <w:szCs w:val="19"/>
         </w:rPr>
-        <w:t xml:space="preserve">Pendiente: URLs por categoría y confirmar "Miles" y "desde $0.53".</w:t>
+        <w:t xml:space="preserve">Pendiente: URLs por categoría y confirmar "1.000+" y "desde $0.53".</w:t>
       </w:r>
     </w:p>
     <w:p>
@@ -11096,7 +11096,7 @@
                 <w:sz w:val="18"/>
                 <w:szCs w:val="18"/>
               </w:rPr>
-              <w:t xml:space="preserve">Tres pilares del enfoque.</w:t>
+              <w:t xml:space="preserve">Tres principios numerados del enfoque.</w:t>
             </w:r>
           </w:p>
         </w:tc>
@@ -11308,7 +11308,7 @@
                 <w:sz w:val="18"/>
                 <w:szCs w:val="18"/>
               </w:rPr>
-              <w:t xml:space="preserve">Cuatro tarjetas con foto, nombre y cargo.</w:t>
+              <w:t xml:space="preserve">Spotlight: una persona por vez (5 personas).</w:t>
             </w:r>
           </w:p>
         </w:tc>
@@ -11711,7 +11711,7 @@
         <w:spacing w:after="60"/>
       </w:pPr>
       <w:r>
-        <w:t xml:space="preserve">Título "Pensamiento estratégico. Ejecución real. Resultados medibles."</w:t>
+        <w:t xml:space="preserve">Título "Tres principios detrás de cada proyecto."</w:t>
       </w:r>
     </w:p>
     <w:p>
@@ -11826,7 +11826,7 @@
         <w:spacing w:after="60"/>
       </w:pPr>
       <w:r>
-        <w:t xml:space="preserve">Título "Organizaciones que confían en nosotros para crear experiencias memorables."</w:t>
+        <w:t xml:space="preserve">Título "Confían en nosotros líderes de la aviación y más allá."</w:t>
       </w:r>
     </w:p>
     <w:p>
@@ -11911,7 +11911,7 @@
         <w:spacing w:after="60"/>
       </w:pPr>
       <w:r>
-        <w:t xml:space="preserve">Alberto Cortes, Dirección Ejecutiva</w:t>
+        <w:t xml:space="preserve">Alberto Cortes, Presidencia</w:t>
       </w:r>
     </w:p>
     <w:p>
@@ -11950,7 +11950,7 @@
         <w:spacing w:after="60"/>
       </w:pPr>
       <w:r>
-        <w:t xml:space="preserve">Alexandra Ortiz, Dirección Comercial</w:t>
+        <w:t xml:space="preserve">Alexandra Ortiz, Dirección Comercial y de Patrocinios</w:t>
       </w:r>
     </w:p>
     <w:p>
@@ -12022,7 +12022,7 @@
         <w:spacing w:after="60"/>
       </w:pPr>
       <w:r>
-        <w:t xml:space="preserve">Texto: "Escribinos directamente o visitanos. Trabajamos con clientes de toda América y más allá."</w:t>
+        <w:t xml:space="preserve">Texto: "Trabajamos desde Coral Gables, a minutos del centro de Miami, con clientes de toda América y más allá."</w:t>
       </w:r>
     </w:p>
     <w:p>
@@ -12125,7 +12125,7 @@
         <w:spacing w:after="60"/>
       </w:pPr>
       <w:r>
-        <w:t xml:space="preserve">"Agenda una llamada" → Contacto del Home.</w:t>
+        <w:t xml:space="preserve">"Agendá una llamada" → Contacto del Home.</w:t>
       </w:r>
     </w:p>
     <w:p>
@@ -12889,7 +12889,7 @@
         <w:spacing w:after="60"/>
       </w:pPr>
       <w:r>
-        <w:t xml:space="preserve">Tienda: URLs por categoría y confirmar "Miles" y "desde $0.53".</w:t>
+        <w:t xml:space="preserve">Tienda: URLs por categoría y confirmar "1.000+" y "desde $0.53".</w:t>
       </w:r>
     </w:p>
     <w:p>
@@ -12929,6 +12929,211 @@
       </w:pPr>
       <w:r>
         <w:t xml:space="preserve">Imagen para redes sociales de 1200 × 630.</w:t>
+      </w:r>
+    </w:p>
+    <w:p>
+      <w:pPr>
+        <w:pStyle w:val="Heading1"/>
+        <w:pageBreakBefore/>
+      </w:pPr>
+      <w:r>
+        <w:t xml:space="preserve">10. Cambios del 26 y 27 de octubre de 2026</w:t>
+      </w:r>
+    </w:p>
+    <w:p>
+      <w:pPr>
+        <w:spacing w:after="120"/>
+      </w:pPr>
+      <w:r>
+        <w:t xml:space="preserve">Resumen de los cambios visuales y de contenido que se hicieron sobre la versión anterior de este documento. Sitio publicado para revisión: https://die-ortiz.github.io/icorporate-site-redesign/mockup/</w:t>
+      </w:r>
+    </w:p>
+    <w:p>
+      <w:pPr>
+        <w:pStyle w:val="Heading2"/>
+      </w:pPr>
+      <w:r>
+        <w:t xml:space="preserve">Home</w:t>
+      </w:r>
+    </w:p>
+    <w:p>
+      <w:pPr>
+        <w:pStyle w:val="ListParagraph"/>
+        <w:numPr>
+          <w:ilvl w:val="0"/>
+          <w:numId w:val="2"/>
+        </w:numPr>
+        <w:spacing w:after="60"/>
+      </w:pPr>
+      <w:r>
+        <w:t xml:space="preserve">Telón de carga (splash): una vez por visita, fondo oscuro con el logo de iCorporate más grande (380 px) y una línea de carga cian; máximo 1,5 s y nunca con movimiento reducido.</w:t>
+      </w:r>
+    </w:p>
+    <w:p>
+      <w:pPr>
+        <w:pStyle w:val="ListParagraph"/>
+        <w:numPr>
+          <w:ilvl w:val="0"/>
+          <w:numId w:val="2"/>
+        </w:numPr>
+        <w:spacing w:after="60"/>
+      </w:pPr>
+      <w:r>
+        <w:t xml:space="preserve">Nuestros servicios: tres tarjetas oscuras grandes que se apilan al hacer scroll (cada una queda fija y la siguiente la tapa; la de abajo se achica y oscurece apenas). Número y color de acento por servicio (cian, azul, lima), descripción, cuatro subservicios en píldoras, foto y botón "Conocer".</w:t>
+      </w:r>
+    </w:p>
+    <w:p>
+      <w:pPr>
+        <w:pStyle w:val="ListParagraph"/>
+        <w:numPr>
+          <w:ilvl w:val="0"/>
+          <w:numId w:val="2"/>
+        </w:numPr>
+        <w:spacing w:after="60"/>
+      </w:pPr>
+      <w:r>
+        <w:t xml:space="preserve">Casos destacados (galería): tarjetas renombradas: ALTA AGM &amp; Airline Leaders Forum · App de la conferencia; ACI-LAC / WAGA · Sesión general; ALTA CCMA &amp; MRO · Sesión general; ALTA AGM &amp; Airline Leaders Forum · Ceremonia de apertura.</w:t>
+      </w:r>
+    </w:p>
+    <w:p>
+      <w:pPr>
+        <w:pStyle w:val="Heading2"/>
+      </w:pPr>
+      <w:r>
+        <w:t xml:space="preserve">Sobre nosotros</w:t>
+      </w:r>
+    </w:p>
+    <w:p>
+      <w:pPr>
+        <w:pStyle w:val="ListParagraph"/>
+        <w:numPr>
+          <w:ilvl w:val="0"/>
+          <w:numId w:val="2"/>
+        </w:numPr>
+        <w:spacing w:after="60"/>
+      </w:pPr>
+      <w:r>
+        <w:t xml:space="preserve">Cómo pensamos: título "Tres principios detrás de cada proyecto."; tres principios numerados unidos por una línea que se llena al entrar en pantalla, cada uno con un ejemplo concreto. Contenido de ejemplo.</w:t>
+      </w:r>
+    </w:p>
+    <w:p>
+      <w:pPr>
+        <w:pStyle w:val="ListParagraph"/>
+        <w:numPr>
+          <w:ilvl w:val="0"/>
+          <w:numId w:val="2"/>
+        </w:numPr>
+        <w:spacing w:after="60"/>
+      </w:pPr>
+      <w:r>
+        <w:t xml:space="preserve">Con quiénes trabajamos: dos columnas (encabezado fijo a la izquierda) y grilla de 3×3 con líneas finas; logos normalizados por peso visual, en gris y en color al pasar el mouse. Título "Confían en nosotros líderes de la aviación y más allá."</w:t>
+      </w:r>
+    </w:p>
+    <w:p>
+      <w:pPr>
+        <w:pStyle w:val="ListParagraph"/>
+        <w:numPr>
+          <w:ilvl w:val="0"/>
+          <w:numId w:val="2"/>
+        </w:numPr>
+        <w:spacing w:after="60"/>
+      </w:pPr>
+      <w:r>
+        <w:t xml:space="preserve">Nuestro equipo: spotlight de casi pantalla completa con el título adentro; una persona por vez con retrato recortado, nombre grande, cargo, bio y botones de LinkedIn, Instagram y correo; miniaturas sobre la parte baja del retrato; entrada escalonada y avance automático cada 7 s.</w:t>
+      </w:r>
+    </w:p>
+    <w:p>
+      <w:pPr>
+        <w:pStyle w:val="ListParagraph"/>
+        <w:numPr>
+          <w:ilvl w:val="0"/>
+          <w:numId w:val="2"/>
+        </w:numPr>
+        <w:spacing w:after="60"/>
+      </w:pPr>
+      <w:r>
+        <w:t xml:space="preserve">Equipo y cargos: Alberto Cortes (Presidencia), Maria Piegari (Dirección de Arte), Alejandro Ortiz (Dirección de TI), Alexandra Ortiz (Dirección Comercial y de Patrocinios) y Diego Ortiz (Asesoría de TI). Retratos, bios y redes de ejemplo, salvo el retrato de Diego.</w:t>
+      </w:r>
+    </w:p>
+    <w:p>
+      <w:pPr>
+        <w:pStyle w:val="ListParagraph"/>
+        <w:numPr>
+          <w:ilvl w:val="0"/>
+          <w:numId w:val="2"/>
+        </w:numPr>
+        <w:spacing w:after="60"/>
+      </w:pPr>
+      <w:r>
+        <w:t xml:space="preserve">Nuestra oficina: tarjeta oscura con mapa de calles de Coral Gables (OpenStreetMap recoloreado, con su atribución obligatoria), pin con pulso, coordenadas y hora de Miami en vivo; dirección, teléfono y correo; botón fantasma "Cómo llegar" (Google Maps, pestaña nueva).</w:t>
+      </w:r>
+    </w:p>
+    <w:p>
+      <w:pPr>
+        <w:pStyle w:val="ListParagraph"/>
+        <w:numPr>
+          <w:ilvl w:val="0"/>
+          <w:numId w:val="2"/>
+        </w:numPr>
+        <w:spacing w:after="60"/>
+      </w:pPr>
+      <w:r>
+        <w:t xml:space="preserve">Llamado final: sección oscura de borde a borde con aurora de marca, título "Tu próximo paso comienza aquí.", bajada "De la primera idea a resultados medibles.", caras del equipo y botones "Agendá una llamada" y "Escribinos".</w:t>
+      </w:r>
+    </w:p>
+    <w:p>
+      <w:pPr>
+        <w:pStyle w:val="Heading2"/>
+      </w:pPr>
+      <w:r>
+        <w:t xml:space="preserve">Corporate Branding</w:t>
+      </w:r>
+    </w:p>
+    <w:p>
+      <w:pPr>
+        <w:pStyle w:val="ListParagraph"/>
+        <w:numPr>
+          <w:ilvl w:val="0"/>
+          <w:numId w:val="2"/>
+        </w:numPr>
+        <w:spacing w:after="60"/>
+      </w:pPr>
+      <w:r>
+        <w:t xml:space="preserve">Qué creamos: bento con Identidad visual en una celda alta y las otras cuatro disciplinas en 2×2; cada una con una mini ilustración animada al pasar el mouse y los entregables como píldoras. Sin etiqueta de ejemplo.</w:t>
+      </w:r>
+    </w:p>
+    <w:p>
+      <w:pPr>
+        <w:pStyle w:val="ListParagraph"/>
+        <w:numPr>
+          <w:ilvl w:val="0"/>
+          <w:numId w:val="2"/>
+        </w:numPr>
+        <w:spacing w:after="60"/>
+      </w:pPr>
+      <w:r>
+        <w:t xml:space="preserve">iCorporate Events Store: "1.000+" productos (antes "Miles").</w:t>
+      </w:r>
+    </w:p>
+    <w:p>
+      <w:pPr>
+        <w:pStyle w:val="Heading2"/>
+      </w:pPr>
+      <w:r>
+        <w:t xml:space="preserve">Todas las páginas</w:t>
+      </w:r>
+    </w:p>
+    <w:p>
+      <w:pPr>
+        <w:pStyle w:val="ListParagraph"/>
+        <w:numPr>
+          <w:ilvl w:val="0"/>
+          <w:numId w:val="2"/>
+        </w:numPr>
+        <w:spacing w:after="60"/>
+      </w:pPr>
+      <w:r>
+        <w:t xml:space="preserve">Asistente iBot rediseñado (panel oscuro con aurora, sugerencias y tarjetas de acceso) y menú con más aire arriba.</w:t>
       </w:r>
     </w:p>
     <w:sectPr>

</xml_diff>